<commit_message>
Diagrama entidad-relacion y modelo relacional
</commit_message>
<xml_diff>
--- a/Hito3/Documentación/Hito 3 - word.docx
+++ b/Hito3/Documentación/Hito 3 - word.docx
@@ -1158,17 +1158,12 @@
         <w:t xml:space="preserve"> and IntelliJ IDEA as </w:t>
       </w:r>
       <w:proofErr w:type="spellStart"/>
-      <w:proofErr w:type="gramStart"/>
       <w:r>
         <w:t>an</w:t>
       </w:r>
       <w:proofErr w:type="spellEnd"/>
       <w:r>
-        <w:t xml:space="preserve"> IDE</w:t>
-      </w:r>
-      <w:proofErr w:type="gramEnd"/>
-      <w:r>
-        <w:t xml:space="preserve"> </w:t>
+        <w:t xml:space="preserve"> IDE </w:t>
       </w:r>
       <w:proofErr w:type="spellStart"/>
       <w:r>
@@ -1839,23 +1834,7 @@
                 <w:rFonts w:eastAsia="Aptos"/>
                 <w:noProof/>
               </w:rPr>
-              <w:t>Admin</w:t>
-            </w:r>
-            <w:r>
-              <w:rPr>
-                <w:rStyle w:val="Hipervnculo"/>
-                <w:rFonts w:eastAsia="Aptos"/>
-                <w:noProof/>
-              </w:rPr>
-              <w:t>i</w:t>
-            </w:r>
-            <w:r>
-              <w:rPr>
-                <w:rStyle w:val="Hipervnculo"/>
-                <w:rFonts w:eastAsia="Aptos"/>
-                <w:noProof/>
-              </w:rPr>
-              <w:t>strador</w:t>
+              <w:t>Administrador</w:t>
             </w:r>
             <w:r>
               <w:rPr>
@@ -3313,49 +3292,7 @@
         <w:rPr>
           <w:rFonts w:ascii="Aptos" w:eastAsia="Aptos" w:hAnsi="Aptos" w:cs="Aptos"/>
         </w:rPr>
-        <w:t xml:space="preserve"> toma como premisa la dificultad que presenta para </w:t>
-      </w:r>
-      <w:proofErr w:type="gramStart"/>
-      <w:r>
-        <w:rPr>
-          <w:rFonts w:ascii="Aptos" w:eastAsia="Aptos" w:hAnsi="Aptos" w:cs="Aptos"/>
-        </w:rPr>
-        <w:t>un joven recién alcanzada</w:t>
-      </w:r>
-      <w:proofErr w:type="gramEnd"/>
-      <w:r>
-        <w:rPr>
-          <w:rFonts w:ascii="Aptos" w:eastAsia="Aptos" w:hAnsi="Aptos" w:cs="Aptos"/>
-        </w:rPr>
-        <w:t xml:space="preserve"> la mayoría de edad, encontrar una residencia temporal mientras se cursa el año académico. El resto de </w:t>
-      </w:r>
-      <w:proofErr w:type="gramStart"/>
-      <w:r>
-        <w:rPr>
-          <w:rFonts w:ascii="Aptos" w:eastAsia="Aptos" w:hAnsi="Aptos" w:cs="Aptos"/>
-        </w:rPr>
-        <w:t>páginas</w:t>
-      </w:r>
-      <w:proofErr w:type="gramEnd"/>
-      <w:r>
-        <w:rPr>
-          <w:rFonts w:ascii="Aptos" w:eastAsia="Aptos" w:hAnsi="Aptos" w:cs="Aptos"/>
-        </w:rPr>
-        <w:t xml:space="preserve"> web ofrecen todo tipo de productos inmobiliarios, desde alquiler y compra de pisos para residencia indefinida hasta de naves industriales y oficinas. Alquiler de estudios y habitaciones también está comprendido pero la oferta, aunque sea elevada, se diluye entre el resto de </w:t>
-      </w:r>
-      <w:proofErr w:type="gramStart"/>
-      <w:r>
-        <w:rPr>
-          <w:rFonts w:ascii="Aptos" w:eastAsia="Aptos" w:hAnsi="Aptos" w:cs="Aptos"/>
-        </w:rPr>
-        <w:t>anuncios</w:t>
-      </w:r>
-      <w:proofErr w:type="gramEnd"/>
-      <w:r>
-        <w:rPr>
-          <w:rFonts w:ascii="Aptos" w:eastAsia="Aptos" w:hAnsi="Aptos" w:cs="Aptos"/>
-        </w:rPr>
-        <w:t>. Como resultado, el cliente puede abrumarse y sentirse frustrado con el proceso, sobre todo al tratarse de alguien joven.</w:t>
+        <w:t xml:space="preserve"> toma como premisa la dificultad que presenta para un joven recién alcanzada la mayoría de edad, encontrar una residencia temporal mientras se cursa el año académico. El resto de páginas web ofrecen todo tipo de productos inmobiliarios, desde alquiler y compra de pisos para residencia indefinida hasta de naves industriales y oficinas. Alquiler de estudios y habitaciones también está comprendido pero la oferta, aunque sea elevada, se diluye entre el resto de anuncios. Como resultado, el cliente puede abrumarse y sentirse frustrado con el proceso, sobre todo al tratarse de alguien joven.</w:t>
       </w:r>
     </w:p>
     <w:p>
@@ -5122,15 +5059,28 @@
       <w:pPr>
         <w:pStyle w:val="Descripcin"/>
       </w:pPr>
-      <w:fldSimple w:instr=" SEQ Ilustración \* ARABIC ">
-        <w:bookmarkStart w:id="7" w:name="_Toc223618249"/>
-        <w:r>
-          <w:rPr>
-            <w:noProof/>
-          </w:rPr>
-          <w:t>1</w:t>
-        </w:r>
-      </w:fldSimple>
+      <w:r>
+        <w:fldChar w:fldCharType="begin"/>
+      </w:r>
+      <w:r>
+        <w:instrText xml:space="preserve"> SEQ Ilustración \* ARABIC </w:instrText>
+      </w:r>
+      <w:r>
+        <w:fldChar w:fldCharType="separate"/>
+      </w:r>
+      <w:bookmarkStart w:id="7" w:name="_Toc223618249"/>
+      <w:r>
+        <w:rPr>
+          <w:noProof/>
+        </w:rPr>
+        <w:t>1</w:t>
+      </w:r>
+      <w:r>
+        <w:rPr>
+          <w:noProof/>
+        </w:rPr>
+        <w:fldChar w:fldCharType="end"/>
+      </w:r>
       <w:r>
         <w:t>-</w:t>
       </w:r>
@@ -5211,21 +5161,662 @@
       <w:pPr>
         <w:pStyle w:val="Descripcin"/>
       </w:pPr>
-      <w:fldSimple w:instr=" SEQ Ilustración \* ARABIC ">
-        <w:bookmarkStart w:id="9" w:name="_Toc223618250"/>
-        <w:r>
-          <w:rPr>
-            <w:noProof/>
-          </w:rPr>
-          <w:t>2</w:t>
-        </w:r>
-      </w:fldSimple>
+      <w:r>
+        <w:fldChar w:fldCharType="begin"/>
+      </w:r>
+      <w:r>
+        <w:instrText xml:space="preserve"> SEQ Ilustración \* ARABIC </w:instrText>
+      </w:r>
+      <w:r>
+        <w:fldChar w:fldCharType="separate"/>
+      </w:r>
+      <w:bookmarkStart w:id="9" w:name="_Toc223618250"/>
+      <w:r>
+        <w:rPr>
+          <w:noProof/>
+        </w:rPr>
+        <w:t>2</w:t>
+      </w:r>
+      <w:r>
+        <w:rPr>
+          <w:noProof/>
+        </w:rPr>
+        <w:fldChar w:fldCharType="end"/>
+      </w:r>
       <w:r>
         <w:t>- Diagrama de clases</w:t>
       </w:r>
       <w:bookmarkEnd w:id="9"/>
     </w:p>
     <w:p/>
+    <w:p>
+      <w:pPr>
+        <w:pStyle w:val="Ttulo2"/>
+      </w:pPr>
+      <w:r>
+        <w:lastRenderedPageBreak/>
+        <w:t>Diagrama Entidad-Relación</w:t>
+      </w:r>
+    </w:p>
+    <w:p>
+      <w:r>
+        <w:rPr>
+          <w:noProof/>
+        </w:rPr>
+        <w:drawing>
+          <wp:inline distT="0" distB="0" distL="0" distR="0" wp14:anchorId="52076896" wp14:editId="0B8F0684">
+            <wp:extent cx="5731510" cy="5176520"/>
+            <wp:effectExtent l="0" t="0" r="2540" b="5080"/>
+            <wp:docPr id="117333727" name="Imagen 1"/>
+            <wp:cNvGraphicFramePr>
+              <a:graphicFrameLocks xmlns:a="http://schemas.openxmlformats.org/drawingml/2006/main" noChangeAspect="1"/>
+            </wp:cNvGraphicFramePr>
+            <a:graphic xmlns:a="http://schemas.openxmlformats.org/drawingml/2006/main">
+              <a:graphicData uri="http://schemas.openxmlformats.org/drawingml/2006/picture">
+                <pic:pic xmlns:pic="http://schemas.openxmlformats.org/drawingml/2006/picture">
+                  <pic:nvPicPr>
+                    <pic:cNvPr id="117333727" name="Imagen 117333727"/>
+                    <pic:cNvPicPr/>
+                  </pic:nvPicPr>
+                  <pic:blipFill>
+                    <a:blip r:embed="rId14">
+                      <a:extLst>
+                        <a:ext uri="{28A0092B-C50C-407E-A947-70E740481C1C}">
+                          <a14:useLocalDpi xmlns:a14="http://schemas.microsoft.com/office/drawing/2010/main" val="0"/>
+                        </a:ext>
+                      </a:extLst>
+                    </a:blip>
+                    <a:stretch>
+                      <a:fillRect/>
+                    </a:stretch>
+                  </pic:blipFill>
+                  <pic:spPr>
+                    <a:xfrm>
+                      <a:off x="0" y="0"/>
+                      <a:ext cx="5731510" cy="5176520"/>
+                    </a:xfrm>
+                    <a:prstGeom prst="rect">
+                      <a:avLst/>
+                    </a:prstGeom>
+                  </pic:spPr>
+                </pic:pic>
+              </a:graphicData>
+            </a:graphic>
+          </wp:inline>
+        </w:drawing>
+      </w:r>
+    </w:p>
+    <w:p>
+      <w:pPr>
+        <w:pStyle w:val="Ttulo2"/>
+      </w:pPr>
+      <w:r>
+        <w:t>Modelo Relacional</w:t>
+      </w:r>
+    </w:p>
+    <w:p>
+      <w:pPr>
+        <w:numPr>
+          <w:ilvl w:val="0"/>
+          <w:numId w:val="18"/>
+        </w:numPr>
+      </w:pPr>
+      <w:r>
+        <w:rPr>
+          <w:b/>
+          <w:bCs/>
+        </w:rPr>
+        <w:t>USER</w:t>
+      </w:r>
+      <w:r>
+        <w:t>(</w:t>
+      </w:r>
+      <w:proofErr w:type="spellStart"/>
+      <w:r>
+        <w:rPr>
+          <w:u w:val="single"/>
+        </w:rPr>
+        <w:t>dni</w:t>
+      </w:r>
+      <w:proofErr w:type="spellEnd"/>
+      <w:r>
+        <w:t xml:space="preserve">, </w:t>
+      </w:r>
+      <w:proofErr w:type="spellStart"/>
+      <w:r>
+        <w:t>name</w:t>
+      </w:r>
+      <w:proofErr w:type="spellEnd"/>
+      <w:r>
+        <w:t xml:space="preserve">, </w:t>
+      </w:r>
+      <w:proofErr w:type="spellStart"/>
+      <w:r>
+        <w:t>surnames</w:t>
+      </w:r>
+      <w:proofErr w:type="spellEnd"/>
+      <w:r>
+        <w:t xml:space="preserve">, </w:t>
+      </w:r>
+      <w:proofErr w:type="spellStart"/>
+      <w:r>
+        <w:t>username</w:t>
+      </w:r>
+      <w:proofErr w:type="spellEnd"/>
+      <w:r>
+        <w:t xml:space="preserve">, </w:t>
+      </w:r>
+      <w:proofErr w:type="spellStart"/>
+      <w:r>
+        <w:t>password</w:t>
+      </w:r>
+      <w:proofErr w:type="spellEnd"/>
+      <w:r>
+        <w:t xml:space="preserve">, </w:t>
+      </w:r>
+      <w:proofErr w:type="spellStart"/>
+      <w:r>
+        <w:t>phone</w:t>
+      </w:r>
+      <w:proofErr w:type="spellEnd"/>
+      <w:r>
+        <w:t xml:space="preserve">, email, </w:t>
+      </w:r>
+      <w:proofErr w:type="spellStart"/>
+      <w:r>
+        <w:t>birthdate</w:t>
+      </w:r>
+      <w:proofErr w:type="spellEnd"/>
+      <w:r>
+        <w:t>)</w:t>
+      </w:r>
+    </w:p>
+    <w:p>
+      <w:pPr>
+        <w:numPr>
+          <w:ilvl w:val="0"/>
+          <w:numId w:val="18"/>
+        </w:numPr>
+      </w:pPr>
+      <w:r>
+        <w:rPr>
+          <w:b/>
+          <w:bCs/>
+        </w:rPr>
+        <w:t>TENANT</w:t>
+      </w:r>
+      <w:r>
+        <w:t>(</w:t>
+      </w:r>
+      <w:proofErr w:type="spellStart"/>
+      <w:r>
+        <w:rPr>
+          <w:u w:val="single"/>
+        </w:rPr>
+        <w:t>dni</w:t>
+      </w:r>
+      <w:proofErr w:type="spellEnd"/>
+      <w:r>
+        <w:t xml:space="preserve"> -&gt; USER, </w:t>
+      </w:r>
+      <w:proofErr w:type="spellStart"/>
+      <w:r>
+        <w:t>studentLicense</w:t>
+      </w:r>
+      <w:proofErr w:type="spellEnd"/>
+      <w:r>
+        <w:t>)</w:t>
+      </w:r>
+    </w:p>
+    <w:p>
+      <w:pPr>
+        <w:numPr>
+          <w:ilvl w:val="0"/>
+          <w:numId w:val="18"/>
+        </w:numPr>
+      </w:pPr>
+      <w:r>
+        <w:rPr>
+          <w:b/>
+          <w:bCs/>
+        </w:rPr>
+        <w:t>OWNER</w:t>
+      </w:r>
+      <w:r>
+        <w:t>(</w:t>
+      </w:r>
+      <w:proofErr w:type="spellStart"/>
+      <w:r>
+        <w:rPr>
+          <w:u w:val="single"/>
+        </w:rPr>
+        <w:t>dni</w:t>
+      </w:r>
+      <w:proofErr w:type="spellEnd"/>
+      <w:r>
+        <w:t xml:space="preserve"> -&gt; USER)</w:t>
+      </w:r>
+    </w:p>
+    <w:p>
+      <w:pPr>
+        <w:numPr>
+          <w:ilvl w:val="0"/>
+          <w:numId w:val="18"/>
+        </w:numPr>
+      </w:pPr>
+      <w:r>
+        <w:rPr>
+          <w:b/>
+          <w:bCs/>
+        </w:rPr>
+        <w:t>CONTRACT</w:t>
+      </w:r>
+      <w:r>
+        <w:t>(</w:t>
+      </w:r>
+      <w:proofErr w:type="spellStart"/>
+      <w:r>
+        <w:rPr>
+          <w:u w:val="single"/>
+        </w:rPr>
+        <w:t>signatureDate</w:t>
+      </w:r>
+      <w:proofErr w:type="spellEnd"/>
+      <w:r>
+        <w:t xml:space="preserve">, </w:t>
+      </w:r>
+      <w:r>
+        <w:rPr>
+          <w:u w:val="single"/>
+        </w:rPr>
+        <w:t>(</w:t>
+      </w:r>
+      <w:proofErr w:type="spellStart"/>
+      <w:r>
+        <w:rPr>
+          <w:u w:val="single"/>
+        </w:rPr>
+        <w:t>num</w:t>
+      </w:r>
+      <w:proofErr w:type="spellEnd"/>
+      <w:r>
+        <w:rPr>
+          <w:u w:val="single"/>
+        </w:rPr>
+        <w:t xml:space="preserve">, </w:t>
+      </w:r>
+      <w:proofErr w:type="spellStart"/>
+      <w:r>
+        <w:rPr>
+          <w:u w:val="single"/>
+        </w:rPr>
+        <w:t>type</w:t>
+      </w:r>
+      <w:proofErr w:type="spellEnd"/>
+      <w:r>
+        <w:rPr>
+          <w:u w:val="single"/>
+        </w:rPr>
+        <w:t xml:space="preserve">, </w:t>
+      </w:r>
+      <w:proofErr w:type="spellStart"/>
+      <w:r>
+        <w:rPr>
+          <w:u w:val="single"/>
+        </w:rPr>
+        <w:t>address</w:t>
+      </w:r>
+      <w:proofErr w:type="spellEnd"/>
+      <w:r>
+        <w:t xml:space="preserve">) -&gt; ROOM, </w:t>
+      </w:r>
+      <w:proofErr w:type="spellStart"/>
+      <w:r>
+        <w:rPr>
+          <w:u w:val="single"/>
+        </w:rPr>
+        <w:t>dni</w:t>
+      </w:r>
+      <w:proofErr w:type="spellEnd"/>
+      <w:r>
+        <w:rPr>
+          <w:u w:val="single"/>
+        </w:rPr>
+        <w:t xml:space="preserve"> </w:t>
+      </w:r>
+      <w:r>
+        <w:t xml:space="preserve">-&gt; TENANT, status, </w:t>
+      </w:r>
+      <w:proofErr w:type="spellStart"/>
+      <w:r>
+        <w:t>pricePerMonth</w:t>
+      </w:r>
+      <w:proofErr w:type="spellEnd"/>
+      <w:r>
+        <w:t xml:space="preserve">, </w:t>
+      </w:r>
+      <w:proofErr w:type="spellStart"/>
+      <w:r>
+        <w:t>startingDate</w:t>
+      </w:r>
+      <w:proofErr w:type="spellEnd"/>
+      <w:r>
+        <w:t xml:space="preserve">, </w:t>
+      </w:r>
+      <w:proofErr w:type="spellStart"/>
+      <w:r>
+        <w:t>endingDate</w:t>
+      </w:r>
+      <w:proofErr w:type="spellEnd"/>
+      <w:r>
+        <w:t>)</w:t>
+      </w:r>
+    </w:p>
+    <w:p>
+      <w:pPr>
+        <w:numPr>
+          <w:ilvl w:val="0"/>
+          <w:numId w:val="18"/>
+        </w:numPr>
+      </w:pPr>
+      <w:r>
+        <w:rPr>
+          <w:b/>
+          <w:bCs/>
+        </w:rPr>
+        <w:t>PROPERTY</w:t>
+      </w:r>
+      <w:r>
+        <w:t>(</w:t>
+      </w:r>
+      <w:proofErr w:type="spellStart"/>
+      <w:r>
+        <w:rPr>
+          <w:u w:val="single"/>
+        </w:rPr>
+        <w:t>address</w:t>
+      </w:r>
+      <w:proofErr w:type="spellEnd"/>
+      <w:r>
+        <w:t xml:space="preserve">, </w:t>
+      </w:r>
+      <w:proofErr w:type="spellStart"/>
+      <w:r>
+        <w:t>surface</w:t>
+      </w:r>
+      <w:proofErr w:type="spellEnd"/>
+      <w:r>
+        <w:t xml:space="preserve">, status, </w:t>
+      </w:r>
+      <w:proofErr w:type="spellStart"/>
+      <w:r>
+        <w:t>dni</w:t>
+      </w:r>
+      <w:proofErr w:type="spellEnd"/>
+      <w:r>
+        <w:t xml:space="preserve"> -&gt; OWNER)</w:t>
+      </w:r>
+    </w:p>
+    <w:p>
+      <w:pPr>
+        <w:numPr>
+          <w:ilvl w:val="0"/>
+          <w:numId w:val="18"/>
+        </w:numPr>
+      </w:pPr>
+      <w:r>
+        <w:rPr>
+          <w:b/>
+          <w:bCs/>
+        </w:rPr>
+        <w:t>ROOM</w:t>
+      </w:r>
+      <w:r>
+        <w:t>(</w:t>
+      </w:r>
+      <w:proofErr w:type="spellStart"/>
+      <w:r>
+        <w:rPr>
+          <w:u w:val="single"/>
+        </w:rPr>
+        <w:t>num</w:t>
+      </w:r>
+      <w:proofErr w:type="spellEnd"/>
+      <w:r>
+        <w:rPr>
+          <w:u w:val="single"/>
+        </w:rPr>
+        <w:t xml:space="preserve">, </w:t>
+      </w:r>
+      <w:proofErr w:type="spellStart"/>
+      <w:r>
+        <w:rPr>
+          <w:u w:val="single"/>
+        </w:rPr>
+        <w:t>type</w:t>
+      </w:r>
+      <w:proofErr w:type="spellEnd"/>
+      <w:r>
+        <w:t>,</w:t>
+      </w:r>
+      <w:r>
+        <w:rPr>
+          <w:u w:val="single"/>
+        </w:rPr>
+        <w:t xml:space="preserve"> </w:t>
+      </w:r>
+      <w:proofErr w:type="spellStart"/>
+      <w:r>
+        <w:rPr>
+          <w:u w:val="single"/>
+        </w:rPr>
+        <w:t>address</w:t>
+      </w:r>
+      <w:proofErr w:type="spellEnd"/>
+      <w:r>
+        <w:t xml:space="preserve"> -&gt; PROPERTY, </w:t>
+      </w:r>
+      <w:proofErr w:type="spellStart"/>
+      <w:r>
+        <w:t>surface</w:t>
+      </w:r>
+      <w:proofErr w:type="spellEnd"/>
+      <w:r>
+        <w:t xml:space="preserve">, status, </w:t>
+      </w:r>
+      <w:proofErr w:type="spellStart"/>
+      <w:r>
+        <w:t>pricePerMonth</w:t>
+      </w:r>
+      <w:proofErr w:type="spellEnd"/>
+      <w:r>
+        <w:t>)</w:t>
+      </w:r>
+    </w:p>
+    <w:p>
+      <w:pPr>
+        <w:numPr>
+          <w:ilvl w:val="0"/>
+          <w:numId w:val="18"/>
+        </w:numPr>
+      </w:pPr>
+      <w:r>
+        <w:rPr>
+          <w:b/>
+          <w:bCs/>
+        </w:rPr>
+        <w:t>FURNITURE</w:t>
+      </w:r>
+      <w:r>
+        <w:t>(</w:t>
+      </w:r>
+      <w:proofErr w:type="spellStart"/>
+      <w:r>
+        <w:rPr>
+          <w:u w:val="single"/>
+        </w:rPr>
+        <w:t>num,type</w:t>
+      </w:r>
+      <w:proofErr w:type="spellEnd"/>
+      <w:r>
+        <w:t xml:space="preserve">, </w:t>
+      </w:r>
+      <w:r>
+        <w:rPr>
+          <w:u w:val="single"/>
+        </w:rPr>
+        <w:t>(</w:t>
+      </w:r>
+      <w:proofErr w:type="spellStart"/>
+      <w:r>
+        <w:rPr>
+          <w:u w:val="single"/>
+        </w:rPr>
+        <w:t>num</w:t>
+      </w:r>
+      <w:proofErr w:type="spellEnd"/>
+      <w:r>
+        <w:rPr>
+          <w:u w:val="single"/>
+        </w:rPr>
+        <w:t xml:space="preserve">, </w:t>
+      </w:r>
+      <w:proofErr w:type="spellStart"/>
+      <w:r>
+        <w:rPr>
+          <w:u w:val="single"/>
+        </w:rPr>
+        <w:t>type</w:t>
+      </w:r>
+      <w:proofErr w:type="spellEnd"/>
+      <w:r>
+        <w:rPr>
+          <w:u w:val="single"/>
+        </w:rPr>
+        <w:t xml:space="preserve">, </w:t>
+      </w:r>
+      <w:proofErr w:type="spellStart"/>
+      <w:r>
+        <w:rPr>
+          <w:u w:val="single"/>
+        </w:rPr>
+        <w:t>address</w:t>
+      </w:r>
+      <w:proofErr w:type="spellEnd"/>
+      <w:r>
+        <w:t xml:space="preserve">) -&gt; ROOM, </w:t>
+      </w:r>
+      <w:proofErr w:type="spellStart"/>
+      <w:r>
+        <w:t>qty</w:t>
+      </w:r>
+      <w:proofErr w:type="spellEnd"/>
+      <w:r>
+        <w:t>)</w:t>
+      </w:r>
+    </w:p>
+    <w:p>
+      <w:pPr>
+        <w:pStyle w:val="Prrafodelista"/>
+        <w:numPr>
+          <w:ilvl w:val="0"/>
+          <w:numId w:val="18"/>
+        </w:numPr>
+      </w:pPr>
+      <w:r>
+        <w:rPr>
+          <w:b/>
+          <w:bCs/>
+        </w:rPr>
+        <w:t>REPORTS</w:t>
+      </w:r>
+      <w:r>
+        <w:t>(</w:t>
+      </w:r>
+      <w:proofErr w:type="spellStart"/>
+      <w:r>
+        <w:rPr>
+          <w:u w:val="single"/>
+        </w:rPr>
+        <w:t>reportDate</w:t>
+      </w:r>
+      <w:proofErr w:type="spellEnd"/>
+      <w:r>
+        <w:t xml:space="preserve">, </w:t>
+      </w:r>
+      <w:proofErr w:type="spellStart"/>
+      <w:r>
+        <w:rPr>
+          <w:u w:val="single"/>
+        </w:rPr>
+        <w:t>dni</w:t>
+      </w:r>
+      <w:proofErr w:type="spellEnd"/>
+      <w:r>
+        <w:t xml:space="preserve"> -&gt; USER,  </w:t>
+      </w:r>
+      <w:r>
+        <w:rPr>
+          <w:u w:val="single"/>
+        </w:rPr>
+        <w:t>(</w:t>
+      </w:r>
+      <w:proofErr w:type="spellStart"/>
+      <w:r>
+        <w:rPr>
+          <w:u w:val="single"/>
+        </w:rPr>
+        <w:t>num</w:t>
+      </w:r>
+      <w:proofErr w:type="spellEnd"/>
+      <w:r>
+        <w:rPr>
+          <w:u w:val="single"/>
+        </w:rPr>
+        <w:t xml:space="preserve">, </w:t>
+      </w:r>
+      <w:proofErr w:type="spellStart"/>
+      <w:r>
+        <w:rPr>
+          <w:u w:val="single"/>
+        </w:rPr>
+        <w:t>type</w:t>
+      </w:r>
+      <w:proofErr w:type="spellEnd"/>
+      <w:r>
+        <w:rPr>
+          <w:u w:val="single"/>
+        </w:rPr>
+        <w:t xml:space="preserve">, </w:t>
+      </w:r>
+      <w:proofErr w:type="spellStart"/>
+      <w:r>
+        <w:rPr>
+          <w:u w:val="single"/>
+        </w:rPr>
+        <w:t>address</w:t>
+      </w:r>
+      <w:proofErr w:type="spellEnd"/>
+      <w:r>
+        <w:t xml:space="preserve">) -&gt; ROOM, </w:t>
+      </w:r>
+      <w:proofErr w:type="spellStart"/>
+      <w:r>
+        <w:t>issue</w:t>
+      </w:r>
+      <w:proofErr w:type="spellEnd"/>
+      <w:r>
+        <w:t xml:space="preserve">, </w:t>
+      </w:r>
+      <w:proofErr w:type="spellStart"/>
+      <w:r>
+        <w:t>details</w:t>
+      </w:r>
+      <w:proofErr w:type="spellEnd"/>
+      <w:r>
+        <w:t>, status)</w:t>
+      </w:r>
+    </w:p>
     <w:p>
       <w:pPr>
         <w:pStyle w:val="Ttulo"/>
@@ -5258,21 +5849,7 @@
         <w:rPr>
           <w:rFonts w:ascii="Aptos" w:eastAsia="Aptos" w:hAnsi="Aptos" w:cs="Aptos"/>
         </w:rPr>
-        <w:t xml:space="preserve">Todo proyecto se rige por un modelo de ciclo de vida. Se tratan de esquemas que organizan las diferentes fases del desarrollo, facilitando la gestión </w:t>
-      </w:r>
-      <w:proofErr w:type="gramStart"/>
-      <w:r>
-        <w:rPr>
-          <w:rFonts w:ascii="Aptos" w:eastAsia="Aptos" w:hAnsi="Aptos" w:cs="Aptos"/>
-        </w:rPr>
-        <w:t>del mismo</w:t>
-      </w:r>
-      <w:proofErr w:type="gramEnd"/>
-      <w:r>
-        <w:rPr>
-          <w:rFonts w:ascii="Aptos" w:eastAsia="Aptos" w:hAnsi="Aptos" w:cs="Aptos"/>
-        </w:rPr>
-        <w:t>.</w:t>
+        <w:t>Todo proyecto se rige por un modelo de ciclo de vida. Se tratan de esquemas que organizan las diferentes fases del desarrollo, facilitando la gestión del mismo.</w:t>
       </w:r>
     </w:p>
     <w:p>
@@ -5301,21 +5878,7 @@
         <w:rPr>
           <w:rFonts w:ascii="Aptos" w:eastAsia="Aptos" w:hAnsi="Aptos" w:cs="Aptos"/>
         </w:rPr>
-        <w:t xml:space="preserve">más, se exige entregar prototipos funcionales repartidos en hitos, por </w:t>
-      </w:r>
-      <w:proofErr w:type="gramStart"/>
-      <w:r>
-        <w:rPr>
-          <w:rFonts w:ascii="Aptos" w:eastAsia="Aptos" w:hAnsi="Aptos" w:cs="Aptos"/>
-        </w:rPr>
-        <w:t>tanto</w:t>
-      </w:r>
-      <w:proofErr w:type="gramEnd"/>
-      <w:r>
-        <w:rPr>
-          <w:rFonts w:ascii="Aptos" w:eastAsia="Aptos" w:hAnsi="Aptos" w:cs="Aptos"/>
-        </w:rPr>
-        <w:t xml:space="preserve"> un </w:t>
+        <w:t xml:space="preserve">más, se exige entregar prototipos funcionales repartidos en hitos, por tanto un </w:t>
       </w:r>
       <w:r>
         <w:rPr>
@@ -5708,7 +6271,7 @@
                     <pic:cNvPicPr/>
                   </pic:nvPicPr>
                   <pic:blipFill>
-                    <a:blip r:embed="rId14">
+                    <a:blip r:embed="rId15">
                       <a:extLst>
                         <a:ext uri="{28A0092B-C50C-407E-A947-70E740481C1C}">
                           <a14:useLocalDpi xmlns:a14="http://schemas.microsoft.com/office/drawing/2010/main"/>
@@ -5740,15 +6303,28 @@
       <w:pPr>
         <w:pStyle w:val="Descripcin"/>
       </w:pPr>
-      <w:fldSimple w:instr=" SEQ Ilustración \* ARABIC ">
-        <w:bookmarkStart w:id="13" w:name="_Toc223618251"/>
-        <w:r>
-          <w:rPr>
-            <w:noProof/>
-          </w:rPr>
-          <w:t>3</w:t>
-        </w:r>
-      </w:fldSimple>
+      <w:r>
+        <w:fldChar w:fldCharType="begin"/>
+      </w:r>
+      <w:r>
+        <w:instrText xml:space="preserve"> SEQ Ilustración \* ARABIC </w:instrText>
+      </w:r>
+      <w:r>
+        <w:fldChar w:fldCharType="separate"/>
+      </w:r>
+      <w:bookmarkStart w:id="13" w:name="_Toc223618251"/>
+      <w:r>
+        <w:rPr>
+          <w:noProof/>
+        </w:rPr>
+        <w:t>3</w:t>
+      </w:r>
+      <w:r>
+        <w:rPr>
+          <w:noProof/>
+        </w:rPr>
+        <w:fldChar w:fldCharType="end"/>
+      </w:r>
       <w:r>
         <w:t>- Tablero Trello Hito 2 1/2</w:t>
       </w:r>
@@ -5780,7 +6356,7 @@
                     <pic:cNvPicPr/>
                   </pic:nvPicPr>
                   <pic:blipFill>
-                    <a:blip r:embed="rId15">
+                    <a:blip r:embed="rId16">
                       <a:extLst>
                         <a:ext uri="{28A0092B-C50C-407E-A947-70E740481C1C}">
                           <a14:useLocalDpi xmlns:a14="http://schemas.microsoft.com/office/drawing/2010/main"/>
@@ -5811,15 +6387,28 @@
       <w:pPr>
         <w:pStyle w:val="Descripcin"/>
       </w:pPr>
-      <w:fldSimple w:instr=" SEQ Ilustración \* ARABIC ">
-        <w:bookmarkStart w:id="14" w:name="_Toc223618252"/>
-        <w:r>
-          <w:rPr>
-            <w:noProof/>
-          </w:rPr>
-          <w:t>4</w:t>
-        </w:r>
-      </w:fldSimple>
+      <w:r>
+        <w:fldChar w:fldCharType="begin"/>
+      </w:r>
+      <w:r>
+        <w:instrText xml:space="preserve"> SEQ Ilustración \* ARABIC </w:instrText>
+      </w:r>
+      <w:r>
+        <w:fldChar w:fldCharType="separate"/>
+      </w:r>
+      <w:bookmarkStart w:id="14" w:name="_Toc223618252"/>
+      <w:r>
+        <w:rPr>
+          <w:noProof/>
+        </w:rPr>
+        <w:t>4</w:t>
+      </w:r>
+      <w:r>
+        <w:rPr>
+          <w:noProof/>
+        </w:rPr>
+        <w:fldChar w:fldCharType="end"/>
+      </w:r>
       <w:r>
         <w:t>- Tablero Trello Hito 2 2/2</w:t>
       </w:r>
@@ -5850,21 +6439,7 @@
         <w:rPr>
           <w:rFonts w:ascii="Aptos" w:eastAsia="Aptos" w:hAnsi="Aptos" w:cs="Aptos"/>
         </w:rPr>
-        <w:t xml:space="preserve">En las primeras iteraciones del proyecto la mayoría de </w:t>
-      </w:r>
-      <w:proofErr w:type="gramStart"/>
-      <w:r>
-        <w:rPr>
-          <w:rFonts w:ascii="Aptos" w:eastAsia="Aptos" w:hAnsi="Aptos" w:cs="Aptos"/>
-        </w:rPr>
-        <w:t>roles</w:t>
-      </w:r>
-      <w:proofErr w:type="gramEnd"/>
-      <w:r>
-        <w:rPr>
-          <w:rFonts w:ascii="Aptos" w:eastAsia="Aptos" w:hAnsi="Aptos" w:cs="Aptos"/>
-        </w:rPr>
-        <w:t xml:space="preserve"> y tareas son compartidas, ya que todos estamos participando conjuntamente en todo tipo de tareas y no necesitamos aún a nadie que haga el rol de jefe de proyecto. En iteraciones más avanzadas tendremos roles y tareas más diferenciadas.</w:t>
+        <w:t>En las primeras iteraciones del proyecto la mayoría de roles y tareas son compartidas, ya que todos estamos participando conjuntamente en todo tipo de tareas y no necesitamos aún a nadie que haga el rol de jefe de proyecto. En iteraciones más avanzadas tendremos roles y tareas más diferenciadas.</w:t>
       </w:r>
     </w:p>
     <w:tbl>
@@ -6111,15 +6686,28 @@
       <w:pPr>
         <w:pStyle w:val="Descripcin"/>
       </w:pPr>
-      <w:fldSimple w:instr=" SEQ Ilustración \* ARABIC ">
-        <w:bookmarkStart w:id="16" w:name="_Toc223618253"/>
-        <w:r>
-          <w:rPr>
-            <w:noProof/>
-          </w:rPr>
-          <w:t>5</w:t>
-        </w:r>
-      </w:fldSimple>
+      <w:r>
+        <w:fldChar w:fldCharType="begin"/>
+      </w:r>
+      <w:r>
+        <w:instrText xml:space="preserve"> SEQ Ilustración \* ARABIC </w:instrText>
+      </w:r>
+      <w:r>
+        <w:fldChar w:fldCharType="separate"/>
+      </w:r>
+      <w:bookmarkStart w:id="16" w:name="_Toc223618253"/>
+      <w:r>
+        <w:rPr>
+          <w:noProof/>
+        </w:rPr>
+        <w:t>5</w:t>
+      </w:r>
+      <w:r>
+        <w:rPr>
+          <w:noProof/>
+        </w:rPr>
+        <w:fldChar w:fldCharType="end"/>
+      </w:r>
       <w:r>
         <w:t>- Planificación de Tareas</w:t>
       </w:r>
@@ -6287,15 +6875,28 @@
       <w:pPr>
         <w:pStyle w:val="Descripcin"/>
       </w:pPr>
-      <w:fldSimple w:instr=" SEQ Ilustración \* ARABIC ">
-        <w:bookmarkStart w:id="17" w:name="_Toc223618254"/>
-        <w:r>
-          <w:rPr>
-            <w:noProof/>
-          </w:rPr>
-          <w:t>6</w:t>
-        </w:r>
-      </w:fldSimple>
+      <w:r>
+        <w:fldChar w:fldCharType="begin"/>
+      </w:r>
+      <w:r>
+        <w:instrText xml:space="preserve"> SEQ Ilustración \* ARABIC </w:instrText>
+      </w:r>
+      <w:r>
+        <w:fldChar w:fldCharType="separate"/>
+      </w:r>
+      <w:bookmarkStart w:id="17" w:name="_Toc223618254"/>
+      <w:r>
+        <w:rPr>
+          <w:noProof/>
+        </w:rPr>
+        <w:t>6</w:t>
+      </w:r>
+      <w:r>
+        <w:rPr>
+          <w:noProof/>
+        </w:rPr>
+        <w:fldChar w:fldCharType="end"/>
+      </w:r>
       <w:r>
         <w:t>- Roles de equipo</w:t>
       </w:r>
@@ -6374,21 +6975,7 @@
         <w:rPr>
           <w:rFonts w:ascii="Aptos" w:eastAsia="Aptos" w:hAnsi="Aptos" w:cs="Aptos"/>
         </w:rPr>
-        <w:t xml:space="preserve">Trabajamos para ayudar a los estudiantes a encontrar pisos durante su año lectivo. El resto de </w:t>
-      </w:r>
-      <w:proofErr w:type="gramStart"/>
-      <w:r>
-        <w:rPr>
-          <w:rFonts w:ascii="Aptos" w:eastAsia="Aptos" w:hAnsi="Aptos" w:cs="Aptos"/>
-        </w:rPr>
-        <w:t>buscadores</w:t>
-      </w:r>
-      <w:proofErr w:type="gramEnd"/>
-      <w:r>
-        <w:rPr>
-          <w:rFonts w:ascii="Aptos" w:eastAsia="Aptos" w:hAnsi="Aptos" w:cs="Aptos"/>
-        </w:rPr>
-        <w:t xml:space="preserve"> abarcan todo el mercado inmobiliario, no filtrando correctamente las posibles conexiones con centros de interés.</w:t>
+        <w:t>Trabajamos para ayudar a los estudiantes a encontrar pisos durante su año lectivo. El resto de buscadores abarcan todo el mercado inmobiliario, no filtrando correctamente las posibles conexiones con centros de interés.</w:t>
       </w:r>
     </w:p>
     <w:p>
@@ -6451,7 +7038,7 @@
         </w:rPr>
         <w:t xml:space="preserve">Alquiler de oficinas </w:t>
       </w:r>
-      <w:hyperlink r:id="rId16">
+      <w:hyperlink r:id="rId17">
         <w:r>
           <w:rPr>
             <w:rStyle w:val="Hipervnculo"/>
@@ -6585,21 +7172,7 @@
         <w:rPr>
           <w:rFonts w:ascii="Aptos" w:eastAsia="Aptos" w:hAnsi="Aptos" w:cs="Aptos"/>
         </w:rPr>
-        <w:t xml:space="preserve">Plan de Hostinger Cloud </w:t>
-      </w:r>
-      <w:proofErr w:type="gramStart"/>
-      <w:r>
-        <w:rPr>
-          <w:rFonts w:ascii="Aptos" w:eastAsia="Aptos" w:hAnsi="Aptos" w:cs="Aptos"/>
-        </w:rPr>
-        <w:t>Startup</w:t>
-      </w:r>
-      <w:proofErr w:type="gramEnd"/>
-      <w:r>
-        <w:rPr>
-          <w:rFonts w:ascii="Aptos" w:eastAsia="Aptos" w:hAnsi="Aptos" w:cs="Aptos"/>
-        </w:rPr>
-        <w:t xml:space="preserve"> 12 meses: 119,88€</w:t>
+        <w:t>Plan de Hostinger Cloud Startup 12 meses: 119,88€</w:t>
       </w:r>
     </w:p>
     <w:p>
@@ -7462,7 +8035,7 @@
         </w:rPr>
         <w:t xml:space="preserve"> </w:t>
       </w:r>
-      <w:hyperlink r:id="rId17">
+      <w:hyperlink r:id="rId18">
         <w:r>
           <w:rPr>
             <w:rStyle w:val="Hipervnculo"/>
@@ -7504,7 +8077,7 @@
         </w:rPr>
         <w:t xml:space="preserve">IES Mutxamel. </w:t>
       </w:r>
-      <w:hyperlink r:id="rId18">
+      <w:hyperlink r:id="rId19">
         <w:r>
           <w:rPr>
             <w:rStyle w:val="Hipervnculo"/>
@@ -7546,7 +8119,7 @@
         </w:rPr>
         <w:t xml:space="preserve">IES Mutxamel. </w:t>
       </w:r>
-      <w:hyperlink r:id="rId19">
+      <w:hyperlink r:id="rId20">
         <w:r>
           <w:rPr>
             <w:rStyle w:val="Hipervnculo"/>
@@ -7580,7 +8153,7 @@
         </w:rPr>
         <w:t xml:space="preserve">. </w:t>
       </w:r>
-      <w:hyperlink r:id="rId20">
+      <w:hyperlink r:id="rId21">
         <w:r>
           <w:rPr>
             <w:rStyle w:val="Hipervnculo"/>
@@ -7592,8 +8165,8 @@
     </w:p>
     <w:p/>
     <w:sectPr>
-      <w:headerReference w:type="default" r:id="rId21"/>
-      <w:footerReference w:type="default" r:id="rId22"/>
+      <w:headerReference w:type="default" r:id="rId22"/>
+      <w:footerReference w:type="default" r:id="rId23"/>
       <w:pgSz w:w="11906" w:h="16838"/>
       <w:pgMar w:top="1440" w:right="1440" w:bottom="1440" w:left="1440" w:header="720" w:footer="720" w:gutter="0"/>
       <w:cols w:space="720"/>
@@ -8698,6 +9271,155 @@
     </w:lvl>
   </w:abstractNum>
   <w:abstractNum w:abstractNumId="8" w15:restartNumberingAfterBreak="0">
+    <w:nsid w:val="415B04F2"/>
+    <w:multiLevelType w:val="multilevel"/>
+    <w:tmpl w:val="DF6E2130"/>
+    <w:lvl w:ilvl="0">
+      <w:start w:val="1"/>
+      <w:numFmt w:val="bullet"/>
+      <w:lvlText w:val=""/>
+      <w:lvlJc w:val="left"/>
+      <w:pPr>
+        <w:tabs>
+          <w:tab w:val="num" w:pos="720"/>
+        </w:tabs>
+        <w:ind w:left="720" w:hanging="360"/>
+      </w:pPr>
+      <w:rPr>
+        <w:rFonts w:ascii="Symbol" w:hAnsi="Symbol" w:hint="default"/>
+        <w:sz w:val="20"/>
+      </w:rPr>
+    </w:lvl>
+    <w:lvl w:ilvl="1" w:tentative="1">
+      <w:start w:val="1"/>
+      <w:numFmt w:val="bullet"/>
+      <w:lvlText w:val="o"/>
+      <w:lvlJc w:val="left"/>
+      <w:pPr>
+        <w:tabs>
+          <w:tab w:val="num" w:pos="1440"/>
+        </w:tabs>
+        <w:ind w:left="1440" w:hanging="360"/>
+      </w:pPr>
+      <w:rPr>
+        <w:rFonts w:ascii="Courier New" w:hAnsi="Courier New" w:hint="default"/>
+        <w:sz w:val="20"/>
+      </w:rPr>
+    </w:lvl>
+    <w:lvl w:ilvl="2" w:tentative="1">
+      <w:start w:val="1"/>
+      <w:numFmt w:val="bullet"/>
+      <w:lvlText w:val=""/>
+      <w:lvlJc w:val="left"/>
+      <w:pPr>
+        <w:tabs>
+          <w:tab w:val="num" w:pos="2160"/>
+        </w:tabs>
+        <w:ind w:left="2160" w:hanging="360"/>
+      </w:pPr>
+      <w:rPr>
+        <w:rFonts w:ascii="Wingdings" w:hAnsi="Wingdings" w:hint="default"/>
+        <w:sz w:val="20"/>
+      </w:rPr>
+    </w:lvl>
+    <w:lvl w:ilvl="3" w:tentative="1">
+      <w:start w:val="1"/>
+      <w:numFmt w:val="bullet"/>
+      <w:lvlText w:val=""/>
+      <w:lvlJc w:val="left"/>
+      <w:pPr>
+        <w:tabs>
+          <w:tab w:val="num" w:pos="2880"/>
+        </w:tabs>
+        <w:ind w:left="2880" w:hanging="360"/>
+      </w:pPr>
+      <w:rPr>
+        <w:rFonts w:ascii="Wingdings" w:hAnsi="Wingdings" w:hint="default"/>
+        <w:sz w:val="20"/>
+      </w:rPr>
+    </w:lvl>
+    <w:lvl w:ilvl="4" w:tentative="1">
+      <w:start w:val="1"/>
+      <w:numFmt w:val="bullet"/>
+      <w:lvlText w:val=""/>
+      <w:lvlJc w:val="left"/>
+      <w:pPr>
+        <w:tabs>
+          <w:tab w:val="num" w:pos="3600"/>
+        </w:tabs>
+        <w:ind w:left="3600" w:hanging="360"/>
+      </w:pPr>
+      <w:rPr>
+        <w:rFonts w:ascii="Wingdings" w:hAnsi="Wingdings" w:hint="default"/>
+        <w:sz w:val="20"/>
+      </w:rPr>
+    </w:lvl>
+    <w:lvl w:ilvl="5" w:tentative="1">
+      <w:start w:val="1"/>
+      <w:numFmt w:val="bullet"/>
+      <w:lvlText w:val=""/>
+      <w:lvlJc w:val="left"/>
+      <w:pPr>
+        <w:tabs>
+          <w:tab w:val="num" w:pos="4320"/>
+        </w:tabs>
+        <w:ind w:left="4320" w:hanging="360"/>
+      </w:pPr>
+      <w:rPr>
+        <w:rFonts w:ascii="Wingdings" w:hAnsi="Wingdings" w:hint="default"/>
+        <w:sz w:val="20"/>
+      </w:rPr>
+    </w:lvl>
+    <w:lvl w:ilvl="6" w:tentative="1">
+      <w:start w:val="1"/>
+      <w:numFmt w:val="bullet"/>
+      <w:lvlText w:val=""/>
+      <w:lvlJc w:val="left"/>
+      <w:pPr>
+        <w:tabs>
+          <w:tab w:val="num" w:pos="5040"/>
+        </w:tabs>
+        <w:ind w:left="5040" w:hanging="360"/>
+      </w:pPr>
+      <w:rPr>
+        <w:rFonts w:ascii="Wingdings" w:hAnsi="Wingdings" w:hint="default"/>
+        <w:sz w:val="20"/>
+      </w:rPr>
+    </w:lvl>
+    <w:lvl w:ilvl="7" w:tentative="1">
+      <w:start w:val="1"/>
+      <w:numFmt w:val="bullet"/>
+      <w:lvlText w:val=""/>
+      <w:lvlJc w:val="left"/>
+      <w:pPr>
+        <w:tabs>
+          <w:tab w:val="num" w:pos="5760"/>
+        </w:tabs>
+        <w:ind w:left="5760" w:hanging="360"/>
+      </w:pPr>
+      <w:rPr>
+        <w:rFonts w:ascii="Wingdings" w:hAnsi="Wingdings" w:hint="default"/>
+        <w:sz w:val="20"/>
+      </w:rPr>
+    </w:lvl>
+    <w:lvl w:ilvl="8" w:tentative="1">
+      <w:start w:val="1"/>
+      <w:numFmt w:val="bullet"/>
+      <w:lvlText w:val=""/>
+      <w:lvlJc w:val="left"/>
+      <w:pPr>
+        <w:tabs>
+          <w:tab w:val="num" w:pos="6480"/>
+        </w:tabs>
+        <w:ind w:left="6480" w:hanging="360"/>
+      </w:pPr>
+      <w:rPr>
+        <w:rFonts w:ascii="Wingdings" w:hAnsi="Wingdings" w:hint="default"/>
+        <w:sz w:val="20"/>
+      </w:rPr>
+    </w:lvl>
+  </w:abstractNum>
+  <w:abstractNum w:abstractNumId="9" w15:restartNumberingAfterBreak="0">
     <w:nsid w:val="41CDF0A9"/>
     <w:multiLevelType w:val="hybridMultilevel"/>
     <w:tmpl w:val="AEB25D38"/>
@@ -8783,7 +9505,7 @@
       </w:pPr>
     </w:lvl>
   </w:abstractNum>
-  <w:abstractNum w:abstractNumId="9" w15:restartNumberingAfterBreak="0">
+  <w:abstractNum w:abstractNumId="10" w15:restartNumberingAfterBreak="0">
     <w:nsid w:val="4B227C16"/>
     <w:multiLevelType w:val="hybridMultilevel"/>
     <w:tmpl w:val="69CE6CCC"/>
@@ -8896,7 +9618,7 @@
       </w:rPr>
     </w:lvl>
   </w:abstractNum>
-  <w:abstractNum w:abstractNumId="10" w15:restartNumberingAfterBreak="0">
+  <w:abstractNum w:abstractNumId="11" w15:restartNumberingAfterBreak="0">
     <w:nsid w:val="4E0A65EB"/>
     <w:multiLevelType w:val="hybridMultilevel"/>
     <w:tmpl w:val="E68E67B0"/>
@@ -9009,7 +9731,7 @@
       </w:rPr>
     </w:lvl>
   </w:abstractNum>
-  <w:abstractNum w:abstractNumId="11" w15:restartNumberingAfterBreak="0">
+  <w:abstractNum w:abstractNumId="12" w15:restartNumberingAfterBreak="0">
     <w:nsid w:val="573BA664"/>
     <w:multiLevelType w:val="multilevel"/>
     <w:tmpl w:val="1BFE550E"/>
@@ -9095,7 +9817,7 @@
       </w:pPr>
     </w:lvl>
   </w:abstractNum>
-  <w:abstractNum w:abstractNumId="12" w15:restartNumberingAfterBreak="0">
+  <w:abstractNum w:abstractNumId="13" w15:restartNumberingAfterBreak="0">
     <w:nsid w:val="5A6F4870"/>
     <w:multiLevelType w:val="hybridMultilevel"/>
     <w:tmpl w:val="94AE46AA"/>
@@ -9208,7 +9930,7 @@
       </w:rPr>
     </w:lvl>
   </w:abstractNum>
-  <w:abstractNum w:abstractNumId="13" w15:restartNumberingAfterBreak="0">
+  <w:abstractNum w:abstractNumId="14" w15:restartNumberingAfterBreak="0">
     <w:nsid w:val="5E20A2D6"/>
     <w:multiLevelType w:val="hybridMultilevel"/>
     <w:tmpl w:val="5956AD64"/>
@@ -9321,7 +10043,7 @@
       </w:rPr>
     </w:lvl>
   </w:abstractNum>
-  <w:abstractNum w:abstractNumId="14" w15:restartNumberingAfterBreak="0">
+  <w:abstractNum w:abstractNumId="15" w15:restartNumberingAfterBreak="0">
     <w:nsid w:val="61EE0F9E"/>
     <w:multiLevelType w:val="multilevel"/>
     <w:tmpl w:val="C5E6BF1E"/>
@@ -9407,7 +10129,7 @@
       </w:pPr>
     </w:lvl>
   </w:abstractNum>
-  <w:abstractNum w:abstractNumId="15" w15:restartNumberingAfterBreak="0">
+  <w:abstractNum w:abstractNumId="16" w15:restartNumberingAfterBreak="0">
     <w:nsid w:val="6E6F6B00"/>
     <w:multiLevelType w:val="hybridMultilevel"/>
     <w:tmpl w:val="65D885F8"/>
@@ -9520,7 +10242,7 @@
       </w:rPr>
     </w:lvl>
   </w:abstractNum>
-  <w:abstractNum w:abstractNumId="16" w15:restartNumberingAfterBreak="0">
+  <w:abstractNum w:abstractNumId="17" w15:restartNumberingAfterBreak="0">
     <w:nsid w:val="7B622CB4"/>
     <w:multiLevelType w:val="hybridMultilevel"/>
     <w:tmpl w:val="86B0A450"/>
@@ -9640,25 +10362,25 @@
     <w:abstractNumId w:val="7"/>
   </w:num>
   <w:num w:numId="3" w16cid:durableId="425276251">
-    <w:abstractNumId w:val="10"/>
+    <w:abstractNumId w:val="11"/>
   </w:num>
   <w:num w:numId="4" w16cid:durableId="267660733">
     <w:abstractNumId w:val="6"/>
   </w:num>
   <w:num w:numId="5" w16cid:durableId="1476215397">
-    <w:abstractNumId w:val="9"/>
+    <w:abstractNumId w:val="10"/>
   </w:num>
   <w:num w:numId="6" w16cid:durableId="1959069539">
     <w:abstractNumId w:val="0"/>
   </w:num>
   <w:num w:numId="7" w16cid:durableId="361321672">
-    <w:abstractNumId w:val="15"/>
+    <w:abstractNumId w:val="16"/>
   </w:num>
   <w:num w:numId="8" w16cid:durableId="2057123933">
-    <w:abstractNumId w:val="8"/>
+    <w:abstractNumId w:val="9"/>
   </w:num>
   <w:num w:numId="9" w16cid:durableId="1011220778">
-    <w:abstractNumId w:val="12"/>
+    <w:abstractNumId w:val="13"/>
   </w:num>
   <w:num w:numId="10" w16cid:durableId="740562609">
     <w:abstractNumId w:val="3"/>
@@ -9670,19 +10392,22 @@
     <w:abstractNumId w:val="5"/>
   </w:num>
   <w:num w:numId="13" w16cid:durableId="516777353">
-    <w:abstractNumId w:val="11"/>
+    <w:abstractNumId w:val="12"/>
   </w:num>
   <w:num w:numId="14" w16cid:durableId="921599014">
-    <w:abstractNumId w:val="13"/>
+    <w:abstractNumId w:val="14"/>
   </w:num>
   <w:num w:numId="15" w16cid:durableId="1471242181">
-    <w:abstractNumId w:val="14"/>
+    <w:abstractNumId w:val="15"/>
   </w:num>
   <w:num w:numId="16" w16cid:durableId="1280255786">
     <w:abstractNumId w:val="2"/>
   </w:num>
   <w:num w:numId="17" w16cid:durableId="1111163449">
-    <w:abstractNumId w:val="16"/>
+    <w:abstractNumId w:val="17"/>
+  </w:num>
+  <w:num w:numId="18" w16cid:durableId="1473985840">
+    <w:abstractNumId w:val="8"/>
   </w:num>
 </w:numbering>
 </file>
@@ -10130,7 +10855,6 @@
   <w:style w:type="character" w:default="1" w:styleId="Fuentedeprrafopredeter">
     <w:name w:val="Default Paragraph Font"/>
     <w:uiPriority w:val="1"/>
-    <w:semiHidden/>
     <w:unhideWhenUsed/>
   </w:style>
   <w:style w:type="table" w:default="1" w:styleId="Tablanormal">
@@ -10633,6 +11357,23 @@
 </file>
 
 <file path=customXml/item2.xml><?xml version="1.0" encoding="utf-8"?>
+<p:properties xmlns:p="http://schemas.microsoft.com/office/2006/metadata/properties" xmlns:xsi="http://www.w3.org/2001/XMLSchema-instance" xmlns:pc="http://schemas.microsoft.com/office/infopath/2007/PartnerControls">
+  <documentManagement>
+    <_activity xmlns="d05fafeb-8cd0-4ca3-bfc2-8403829aa73e" xsi:nil="true"/>
+  </documentManagement>
+</p:properties>
+</file>
+
+<file path=customXml/item3.xml><?xml version="1.0" encoding="utf-8"?>
+<?mso-contentType ?>
+<FormTemplates xmlns="http://schemas.microsoft.com/sharepoint/v3/contenttype/forms">
+  <Display>DocumentLibraryForm</Display>
+  <Edit>DocumentLibraryForm</Edit>
+  <New>DocumentLibraryForm</New>
+</FormTemplates>
+</file>
+
+<file path=customXml/item4.xml><?xml version="1.0" encoding="utf-8"?>
 <ct:contentTypeSchema xmlns:ct="http://schemas.microsoft.com/office/2006/metadata/contentType" xmlns:ma="http://schemas.microsoft.com/office/2006/metadata/properties/metaAttributes" ct:_="" ma:_="" ma:contentTypeName="Documento" ma:contentTypeID="0x0101002F5E8EE332397542B8BB75AF29E80DA2" ma:contentTypeVersion="5" ma:contentTypeDescription="Crear nuevo documento." ma:contentTypeScope="" ma:versionID="4d02e74581b067f40c888b71b534a43b">
   <xsd:schema xmlns:xsd="http://www.w3.org/2001/XMLSchema" xmlns:xs="http://www.w3.org/2001/XMLSchema" xmlns:p="http://schemas.microsoft.com/office/2006/metadata/properties" xmlns:ns3="d05fafeb-8cd0-4ca3-bfc2-8403829aa73e" targetNamespace="http://schemas.microsoft.com/office/2006/metadata/properties" ma:root="true" ma:fieldsID="6f6ea4f18b227e563cf6e8dad0eb12f1" ns3:_="">
     <xsd:import namespace="d05fafeb-8cd0-4ca3-bfc2-8403829aa73e"/>
@@ -10782,23 +11523,6 @@
 </ct:contentTypeSchema>
 </file>
 
-<file path=customXml/item3.xml><?xml version="1.0" encoding="utf-8"?>
-<?mso-contentType ?>
-<FormTemplates xmlns="http://schemas.microsoft.com/sharepoint/v3/contenttype/forms">
-  <Display>DocumentLibraryForm</Display>
-  <Edit>DocumentLibraryForm</Edit>
-  <New>DocumentLibraryForm</New>
-</FormTemplates>
-</file>
-
-<file path=customXml/item4.xml><?xml version="1.0" encoding="utf-8"?>
-<p:properties xmlns:p="http://schemas.microsoft.com/office/2006/metadata/properties" xmlns:xsi="http://www.w3.org/2001/XMLSchema-instance" xmlns:pc="http://schemas.microsoft.com/office/infopath/2007/PartnerControls">
-  <documentManagement>
-    <_activity xmlns="d05fafeb-8cd0-4ca3-bfc2-8403829aa73e" xsi:nil="true"/>
-  </documentManagement>
-</p:properties>
-</file>
-
 <file path=customXml/itemProps1.xml><?xml version="1.0" encoding="utf-8"?>
 <ds:datastoreItem xmlns:ds="http://schemas.openxmlformats.org/officeDocument/2006/customXml" ds:itemID="{84CA4A16-CE6B-4C64-8CA7-CF5CBE9EE313}">
   <ds:schemaRefs>
@@ -10808,6 +11532,24 @@
 </file>
 
 <file path=customXml/itemProps2.xml><?xml version="1.0" encoding="utf-8"?>
+<ds:datastoreItem xmlns:ds="http://schemas.openxmlformats.org/officeDocument/2006/customXml" ds:itemID="{6C973ABE-01AD-4479-91B2-6C831642CD01}">
+  <ds:schemaRefs>
+    <ds:schemaRef ds:uri="http://schemas.microsoft.com/office/2006/metadata/properties"/>
+    <ds:schemaRef ds:uri="http://schemas.microsoft.com/office/infopath/2007/PartnerControls"/>
+    <ds:schemaRef ds:uri="d05fafeb-8cd0-4ca3-bfc2-8403829aa73e"/>
+  </ds:schemaRefs>
+</ds:datastoreItem>
+</file>
+
+<file path=customXml/itemProps3.xml><?xml version="1.0" encoding="utf-8"?>
+<ds:datastoreItem xmlns:ds="http://schemas.openxmlformats.org/officeDocument/2006/customXml" ds:itemID="{9C62D19F-2C4B-4163-B98D-18BF5B309744}">
+  <ds:schemaRefs>
+    <ds:schemaRef ds:uri="http://schemas.microsoft.com/sharepoint/v3/contenttype/forms"/>
+  </ds:schemaRefs>
+</ds:datastoreItem>
+</file>
+
+<file path=customXml/itemProps4.xml><?xml version="1.0" encoding="utf-8"?>
 <ds:datastoreItem xmlns:ds="http://schemas.openxmlformats.org/officeDocument/2006/customXml" ds:itemID="{1DB4DC36-AD7A-4853-9C6B-4ADFFDB99AD0}">
   <ds:schemaRefs>
     <ds:schemaRef ds:uri="http://schemas.microsoft.com/office/2006/metadata/contentType"/>
@@ -10823,22 +11565,4 @@
     <ds:schemaRef ds:uri="http://schemas.microsoft.com/internal/obd"/>
   </ds:schemaRefs>
 </ds:datastoreItem>
-</file>
-
-<file path=customXml/itemProps3.xml><?xml version="1.0" encoding="utf-8"?>
-<ds:datastoreItem xmlns:ds="http://schemas.openxmlformats.org/officeDocument/2006/customXml" ds:itemID="{9C62D19F-2C4B-4163-B98D-18BF5B309744}">
-  <ds:schemaRefs>
-    <ds:schemaRef ds:uri="http://schemas.microsoft.com/sharepoint/v3/contenttype/forms"/>
-  </ds:schemaRefs>
-</ds:datastoreItem>
-</file>
-
-<file path=customXml/itemProps4.xml><?xml version="1.0" encoding="utf-8"?>
-<ds:datastoreItem xmlns:ds="http://schemas.openxmlformats.org/officeDocument/2006/customXml" ds:itemID="{6C973ABE-01AD-4479-91B2-6C831642CD01}">
-  <ds:schemaRefs>
-    <ds:schemaRef ds:uri="http://schemas.microsoft.com/office/2006/metadata/properties"/>
-    <ds:schemaRef ds:uri="http://schemas.microsoft.com/office/infopath/2007/PartnerControls"/>
-    <ds:schemaRef ds:uri="d05fafeb-8cd0-4ca3-bfc2-8403829aa73e"/>
-  </ds:schemaRefs>
-</ds:datastoreItem>
 </file>
</xml_diff>